<commit_message>
fiscr amicus-brief docx: Times New Roman (the typst face) via docx/reference.xml, XML-identical to the old builder's output with the font changed; sample frontmatter typeface corrected to Times New Roman (both certificates named EB Garamond); check.sh docx 8/0 and typst 8/0 (fb-595.63)
</commit_message>
<xml_diff>
--- a/courts/national/foreign-intelligence-surveillance-court-of-review/amicus-brief/usage/OUTPUT-amicus-brief.docx
+++ b/courts/national/foreign-intelligence-surveillance-court-of-review/amicus-brief/usage/OUTPUT-amicus-brief.docx
@@ -348,7 +348,7 @@
         <w:tab/>
       </w:r>
       <w:r>
-        <w:t xml:space="preserve">2</w:t>
+        <w:t xml:space="preserve">3</w:t>
       </w:r>
     </w:p>
     <w:p>
@@ -368,7 +368,7 @@
         <w:tab/>
       </w:r>
       <w:r>
-        <w:t xml:space="preserve">2</w:t>
+        <w:t xml:space="preserve">3</w:t>
       </w:r>
     </w:p>
     <w:p>
@@ -648,7 +648,7 @@
         <w:tab/>
       </w:r>
       <w:r>
-        <w:t xml:space="preserve">2</w:t>
+        <w:t xml:space="preserve">3</w:t>
       </w:r>
     </w:p>
     <w:p>
@@ -1304,7 +1304,7 @@
         <w:pStyle w:val="CheckLine"/>
       </w:pPr>
       <w:r>
-        <w:t xml:space="preserve">[X] this brief complies with the typeface requirements of Fed. R. App. P. 32(a)(5) and the type-style requirements of Fed. R. App. P. 32(a)(6): it has been prepared in a proportionally spaced typeface using Typst 0.15.0 in 14-point EB Garamond roman type.</w:t>
+        <w:t xml:space="preserve">[X] this brief complies with the typeface requirements of Fed. R. App. P. 32(a)(5) and the type-style requirements of Fed. R. App. P. 32(a)(6): it has been prepared in a proportionally spaced typeface using Typst 0.15.0 in 14-point Times New Roman roman type.</w:t>
       </w:r>
     </w:p>
     <w:p>
@@ -1604,11 +1604,11 @@
 </file>
 
 <file path=word/styles.xml><?xml version="1.0" encoding="utf-8"?>
-<w:styles xmlns:r="http://schemas.openxmlformats.org/officeDocument/2006/relationships" xmlns:w="http://schemas.openxmlformats.org/wordprocessingml/2006/main">
+<w:styles xmlns:w="http://schemas.openxmlformats.org/wordprocessingml/2006/main" xmlns:r="http://schemas.openxmlformats.org/officeDocument/2006/relationships">
   <w:docDefaults>
     <w:rPrDefault>
       <w:rPr>
-        <w:rFonts w:ascii="EB Garamond" w:hAnsi="EB Garamond" w:eastAsia="EB Garamond" w:cs="EB Garamond"/>
+        <w:rFonts w:ascii="Times New Roman" w:hAnsi="Times New Roman" w:eastAsia="Times New Roman" w:cs="Times New Roman"/>
         <w:sz w:val="28"/>
         <w:szCs w:val="28"/>
         <w:lang w:val="en-US" w:eastAsia="en-US" w:bidi="ar-SA"/>
@@ -2011,7 +2011,7 @@
       <w:ind w:firstLine="0"/>
     </w:pPr>
     <w:rPr>
-      <w:rFonts w:ascii="EB Garamond" w:hAnsi="EB Garamond" w:eastAsia="EB Garamond" w:cs="EB Garamond"/>
+      <w:rFonts w:ascii="Times New Roman" w:hAnsi="Times New Roman" w:eastAsia="Times New Roman" w:cs="Times New Roman"/>
       <w:sz w:val="28"/>
       <w:szCs w:val="28"/>
     </w:rPr>

</xml_diff>

<commit_message>
FISCR amicus brief: fb render builds the docx (render.sh, pages.sh and pages.awk deleted): fiscr-amicus.lua writes needles in document order (the cover for page i, the contents headings with the words after them, every citation) and the last section; reference.xml names the face only as {font}. .docx.pdf byte-identical to the render before the port; check.sh typst and docx 0 failed (fb-595.68.4)
</commit_message>
<xml_diff>
--- a/courts/national/foreign-intelligence-surveillance-court-of-review/amicus-brief/usage/OUTPUT-amicus-brief.docx
+++ b/courts/national/foreign-intelligence-surveillance-court-of-review/amicus-brief/usage/OUTPUT-amicus-brief.docx
@@ -1517,6 +1517,72 @@
     </w:p>
   </w:footnote>
 </w:footnotes>
+</file>
+
+<file path=word/ftr-add.xml><?xml version="1.0" encoding="utf-8"?>
+<w:ftr xmlns:w="http://schemas.openxmlformats.org/wordprocessingml/2006/main" xmlns:r="http://schemas.openxmlformats.org/officeDocument/2006/relationships">
+  <w:p>
+    <w:pPr>
+      <w:spacing w:before="0" w:after="0"/>
+      <w:jc w:val="center"/>
+    </w:pPr>
+    <w:r>
+      <w:t>Add-</w:t>
+    </w:r>
+    <w:r>
+      <w:fldChar w:fldCharType="begin"/>
+    </w:r>
+    <w:r>
+      <w:instrText xml:space="preserve"> PAGE </w:instrText>
+    </w:r>
+    <w:r>
+      <w:fldChar w:fldCharType="separate"/>
+    </w:r>
+    <w:r>
+      <w:t>1</w:t>
+    </w:r>
+    <w:r>
+      <w:fldChar w:fldCharType="end"/>
+    </w:r>
+  </w:p>
+</w:ftr>
+</file>
+
+<file path=word/ftr-none.xml><?xml version="1.0" encoding="utf-8"?>
+<w:ftr xmlns:w="http://schemas.openxmlformats.org/wordprocessingml/2006/main" xmlns:r="http://schemas.openxmlformats.org/officeDocument/2006/relationships">
+  <w:p>
+    <w:pPr>
+      <w:spacing w:before="0" w:after="0"/>
+      <w:jc w:val="center"/>
+    </w:pPr>
+  </w:p>
+</w:ftr>
+</file>
+
+<file path=word/ftr-page.xml><?xml version="1.0" encoding="utf-8"?>
+<w:ftr xmlns:w="http://schemas.openxmlformats.org/wordprocessingml/2006/main" xmlns:r="http://schemas.openxmlformats.org/officeDocument/2006/relationships">
+  <w:p>
+    <w:pPr>
+      <w:spacing w:before="0" w:after="0"/>
+      <w:jc w:val="center"/>
+    </w:pPr>
+    <w:r>
+      <w:fldChar w:fldCharType="begin"/>
+    </w:r>
+    <w:r>
+      <w:instrText xml:space="preserve"> PAGE </w:instrText>
+    </w:r>
+    <w:r>
+      <w:fldChar w:fldCharType="separate"/>
+    </w:r>
+    <w:r>
+      <w:t>1</w:t>
+    </w:r>
+    <w:r>
+      <w:fldChar w:fldCharType="end"/>
+    </w:r>
+  </w:p>
+</w:ftr>
 </file>
 
 <file path=word/numbering.xml><?xml version="1.0" encoding="utf-8"?>

</xml_diff>